<commit_message>
docs+chore: memoria no sobreclama el cron de ML_10, ticket 105 para desplegarlo
Auditando mas alla de VIKT_*: verificado en esta EC2 que el cron.d del
reentrenamiento nocturno (ML_10) nunca se instalo (/etc/cron.d/ sin el,
sin crontab de ubuntu) -- su propio doc/ML-10 ya lo admitia como "paso de
despliegue pendiente", pero mi redaccion de VIKT_02 en S5.4/5.5 lo
describia como si ya estuviera programado en produccion. Corregido a
"disenado y verificado a mano, programacion pendiente de desplegar", con
una nota explicita anadida a S7.4 junto al backtest incremental.

Filed como ticket 105 (no desplegado directamente -- un cron con
credenciales AWS recurrente y sin supervision necesita aprobacion
explicita, mismo criterio que un terraform apply).

PLAN.md actualizado: proximo numero libre 106.
</commit_message>
<xml_diff>
--- a/documents/Memoria_TFM FV.docx
+++ b/documents/Memoria_TFM FV.docx
@@ -3404,7 +3404,7 @@
         <w:jc w:val="both"/>
       </w:pPr>
       <w:r>
-        <w:t>Una de las premisas del proyecto es el coste cero en datos y software. Todas las fuentes son datos abiertos públicos y toda la pila tecnológica se apoya en servicios gestionados de AWS dentro de su nivel gratuito (Lambda, EventBridge Scheduler, Glue, Athena, S3) y en Neo4j AuraDB Free; el proyecto no requiere coste material en su núcleo. Tampoco lo añade el pipeline de modelado: MLflow usa un backend SQLite local (sin servidor), el reentrenamiento nocturno se programa con `cron` en la misma instancia (sin recursos nuevos de AWS) y la inferencia ONNX corre sobre CPU. El único gasto real observado en desarrollo proviene de las ejecuciones de AWS Glue fuera del nivel gratuito, vigilado con una herramienta de estimación y desglose de coste construida para el proyecto (`herramientas/costes/`).</w:t>
+        <w:t>Una de las premisas del proyecto es el coste cero en datos y software. Todas las fuentes son datos abiertos públicos y toda la pila tecnológica se apoya en servicios gestionados de AWS dentro de su nivel gratuito (Lambda, EventBridge Scheduler, Glue, Athena, S3) y en Neo4j AuraDB Free; el proyecto no requiere coste material en su núcleo. Tampoco lo añade el pipeline de modelado: MLflow usa un backend SQLite local (sin servidor), el reentrenamiento nocturno está diseñado para programarse con `cron` en la misma instancia (sin recursos nuevos de AWS) y la inferencia ONNX corre sobre CPU. El único gasto real observado en desarrollo proviene de las ejecuciones de AWS Glue fuera del nivel gratuito, vigilado con una herramienta de estimación y desglose de coste construida para el proyecto (`herramientas/costes/`).</w:t>
       </w:r>
     </w:p>
     <w:tbl>
@@ -3854,7 +3854,7 @@
     <w:p>
       <w:pPr/>
       <w:r>
-        <w:t>Los forecasters de árbol (LightGBM) se exportan a ONNX para una ejecución portable: el modelo servido reproduce al nativo con un error medio de en torno al 0,1 % de la escala del target, dentro de la tolerancia definida en `modelado/export/CONTRATO.md`, que fija también el orden, tipo y unidad de cada feature de entrada. El modelo de grafo (STGNN) no exporta a ONNX por una limitación conocida de `torch.export` con su bucle temporal; mientras tanto se sirve directamente desde su registro nativo (véase 7.4 y 7.5). El despliegue de la infraestructura se gestiona íntegramente como código con Terraform; el reentrenamiento del modelo se programa por separado, una vez al día, con una tarea `cron` en la propia instancia —sin crear infraestructura nueva—, que reconstruye el panel de datos, reentrena, evalúa contra el modelo vigente y solo promueve la nueva versión si no empeora.</w:t>
+        <w:t>Los forecasters de árbol (LightGBM) se exportan a ONNX para una ejecución portable: el modelo servido reproduce al nativo con un error medio de en torno al 0,1 % de la escala del target, dentro de la tolerancia definida en `modelado/export/CONTRATO.md`, que fija también el orden, tipo y unidad de cada feature de entrada. El modelo de grafo (STGNN) no exporta a ONNX por una limitación conocida de `torch.export` con su bucle temporal; mientras tanto se sirve directamente desde su registro nativo (véase 7.4 y 7.5). El despliegue de la infraestructura se gestiona íntegramente como código con Terraform; el reentrenamiento del modelo se ha verificado manualmente y se ejecuta por separado del resto del pipeline, mediante una tarea `cron` en la propia instancia —sin crear infraestructura nueva—, que reconstruye el panel de datos, reentrena, evalúa contra el modelo vigente y solo promueve la nueva versión si no empeora; su programación periódica en producción es el último paso de despliegue pendiente (véase 7.4).</w:t>
       </w:r>
     </w:p>
     <w:p>
@@ -5185,7 +5185,7 @@
         <w:jc w:val="both"/>
       </w:pPr>
       <w:r>
-        <w:t>El backtest incremental (entrenamientos sucesivos con más días de historia) muestra la mejora esperada pero con varianza alta: el skill a 6 h de calidad del aire sube de ~0,63 (22/8) a ~0,80 (27/8), con un bache real a 0,11 el 25/8 (dos días peores en los propios datos, no un artefacto) — evidencia directa de que el modelo aún no ha convergido con esta ventana de datos.</w:t>
+        <w:t>El backtest incremental (entrenamientos sucesivos con más días de historia) muestra la mejora esperada pero con varianza alta: el skill a 6 h de calidad del aire sube de ~0,63 (22/8) a ~0,80 (27/8), con un bache real a 0,11 el 25/8 (dos días peores en los propios datos, no un artefacto) — evidencia directa de que el modelo aún no ha convergido con esta ventana de datos. El mecanismo de reentrenamiento nocturno que alimentaría esa curva en producción está construido y verificado manualmente, pero su programación periódica (una tarea `cron` en la instancia) todavía no está desplegada — es el último paso pendiente antes de que el modelo se mantenga fresco sin intervención manual.</w:t>
       </w:r>
     </w:p>
     <w:p>

</xml_diff>

<commit_message>
docs(memoria): 3 diagramas mas -- modelo de grafo, catalogo MCP/chat, pipeline de analitica de grafo
Cubre explicitamente las 3 areas que quedaban solo en prosa: el
modelo del grafo urbano (labels/relaciones con su recuento real,
Figura 3, S6.6), el catalogo de las 19 tools MCP agrupadas por familia
+ las 3 superficies que comparten el mismo chat (Figura 5, S6.7), y el
pipeline de analitica de grafo -- centralidad, comunidades, resiliencia
-- desde el snapshot offline hasta los artefactos que consume el
explorador en vivo (Figura 7, S7.3).

Renumeradas las figuras existentes para mantener el orden correlativo
del documento: secuencia de consulta 3->4, pipeline de modelado 4->6,
curva de resiliencia 5->8. 8 figuras en total, todas verificadas en
orden y sin referencias cruzadas rotas.

Co-Authored-By: Claude Sonnet 5 <noreply@anthropic.com>
Claude-Session: https://claude.ai/code/session_01C7H5WkThVrptLbmPkjz1CL
</commit_message>
<xml_diff>
--- a/documents/Memoria_TFM FV.docx
+++ b/documents/Memoria_TFM FV.docx
@@ -4140,6 +4140,55 @@
     </w:p>
     <w:p>
       <w:pPr>
+        <w:spacing w:after="160" w:line="276" w:lineRule="auto"/>
+        <w:jc w:val="both"/>
+      </w:pPr>
+      <w:r>
+        <w:drawing>
+          <wp:inline xmlns:a="http://schemas.openxmlformats.org/drawingml/2006/main" xmlns:pic="http://schemas.openxmlformats.org/drawingml/2006/picture">
+            <wp:extent cx="5760720" cy="1214794"/>
+            <wp:docPr id="1217661473" name="Picture 1217661473"/>
+            <wp:cNvGraphicFramePr>
+              <a:graphicFrameLocks noChangeAspect="1"/>
+            </wp:cNvGraphicFramePr>
+            <a:graphic>
+              <a:graphicData uri="http://schemas.openxmlformats.org/drawingml/2006/picture">
+                <pic:pic>
+                  <pic:nvPicPr>
+                    <pic:cNvPr id="0" name="05_modelo_grafo.png"/>
+                    <pic:cNvPicPr/>
+                  </pic:nvPicPr>
+                  <pic:blipFill>
+                    <a:blip r:embed="rId19"/>
+                    <a:stretch>
+                      <a:fillRect/>
+                    </a:stretch>
+                  </pic:blipFill>
+                  <pic:spPr>
+                    <a:xfrm>
+                      <a:off x="0" y="0"/>
+                      <a:ext cx="5760720" cy="1214794"/>
+                    </a:xfrm>
+                    <a:prstGeom prst="rect"/>
+                  </pic:spPr>
+                </pic:pic>
+              </a:graphicData>
+            </a:graphic>
+          </wp:inline>
+        </w:drawing>
+      </w:r>
+    </w:p>
+    <w:p>
+      <w:pPr>
+        <w:spacing w:after="160" w:line="276" w:lineRule="auto"/>
+        <w:jc w:val="both"/>
+      </w:pPr>
+      <w:r>
+        <w:t>Figura 3. Modelo del grafo urbano: labels de nodo y tipos de relación, con el recuento real de cada uno.</w:t>
+      </w:r>
+    </w:p>
+    <w:p>
+      <w:pPr>
         <w:pStyle w:val="Ttulo2"/>
       </w:pPr>
       <w:bookmarkStart w:id="22" w:name="_Toc233752757"/>
@@ -4220,7 +4269,7 @@
         <w:jc w:val="both"/>
       </w:pPr>
       <w:r>
-        <w:t>Figura 3. Secuencia de una consulta al asistente conversacional, de principio a fin.</w:t>
+        <w:t>Figura 4. Secuencia de una consulta al asistente conversacional, de principio a fin.</w:t>
       </w:r>
     </w:p>
     <w:p>
@@ -4238,7 +4287,65 @@
         <w:jc w:val="both"/>
       </w:pPr>
       <w:r>
-        <w:t>Las dos superficies públicas de referencia, sin embargo, viven en GitHub Pages —gratuitas, sin autenticación y sin necesidad de una instancia dedicada al frontend— y ambas incorporan ya el mismo chat incrustado directamente en la página, no solo un enlace a la aplicación de demostración: el mapa animado, que recorre hora a hora los 1798 nodos de tráfico del grafo con la previsión de los modelos (tráfico y calidad del aire), resaltando las aristas más influyentes y un índice de salud por nodo, con una capa social y de accesibilidad de nueve perfiles de sensibilidad y bandas de referencia OMS/UE, generado íntegramente sin conexión a los sistemas en vivo; y el explorador del grafo urbano en vivo, que sí consulta Neo4j directamente y en solo lectura para mostrar nodos, aristas de transporte y vecindarios de proximidad reales en cada momento. En ambas superficies, el chat ya no es una caja negra: cada respuesta muestra una traza de qué herramientas del agente MCP se invocaron para construirla, y un catálogo de preguntas sugeridas ayuda a quien no conoce el sistema a empezar (Figura 3).</w:t>
+        <w:t>Las dos superficies públicas de referencia, sin embargo, viven en GitHub Pages —gratuitas, sin autenticación y sin necesidad de una instancia dedicada al frontend— y ambas incorporan ya el mismo chat incrustado directamente en la página, no solo un enlace a la aplicación de demostración: el mapa animado, que recorre hora a hora los 1798 nodos de tráfico del grafo con la previsión de los modelos (tráfico y calidad del aire), resaltando las aristas más influyentes y un índice de salud por nodo, con una capa social y de accesibilidad de nueve perfiles de sensibilidad y bandas de referencia OMS/UE, generado íntegramente sin conexión a los sistemas en vivo; y el explorador del grafo urbano en vivo, que sí consulta Neo4j directamente y en solo lectura para mostrar nodos, aristas de transporte y vecindarios de proximidad reales en cada momento. En ambas superficies, el chat ya no es una caja negra: cada respuesta muestra una traza de qué herramientas del agente MCP se invocaron para construirla, y un catálogo de preguntas sugeridas ayuda a quien no conoce el sistema a empezar (Figura 4).</w:t>
+      </w:r>
+    </w:p>
+    <w:p>
+      <w:pPr>
+        <w:spacing w:after="160" w:line="276" w:lineRule="auto"/>
+        <w:jc w:val="both"/>
+      </w:pPr>
+      <w:r>
+        <w:t>La Figura 5 resume el catálogo completo: qué familia de tools resuelve cada tipo de pregunta y contra qué sistema real consulta cada una.</w:t>
+      </w:r>
+    </w:p>
+    <w:p>
+      <w:pPr>
+        <w:spacing w:after="160" w:line="276" w:lineRule="auto"/>
+        <w:jc w:val="both"/>
+      </w:pPr>
+      <w:r>
+        <w:drawing>
+          <wp:inline xmlns:a="http://schemas.openxmlformats.org/drawingml/2006/main" xmlns:pic="http://schemas.openxmlformats.org/drawingml/2006/picture">
+            <wp:extent cx="5760720" cy="2699102"/>
+            <wp:docPr id="1217661474" name="Picture 1217661474"/>
+            <wp:cNvGraphicFramePr>
+              <a:graphicFrameLocks noChangeAspect="1"/>
+            </wp:cNvGraphicFramePr>
+            <a:graphic>
+              <a:graphicData uri="http://schemas.openxmlformats.org/drawingml/2006/picture">
+                <pic:pic>
+                  <pic:nvPicPr>
+                    <pic:cNvPr id="0" name="07_mcp_chat.png"/>
+                    <pic:cNvPicPr/>
+                  </pic:nvPicPr>
+                  <pic:blipFill>
+                    <a:blip r:embed="rId20"/>
+                    <a:stretch>
+                      <a:fillRect/>
+                    </a:stretch>
+                  </pic:blipFill>
+                  <pic:spPr>
+                    <a:xfrm>
+                      <a:off x="0" y="0"/>
+                      <a:ext cx="5760720" cy="2699102"/>
+                    </a:xfrm>
+                    <a:prstGeom prst="rect"/>
+                  </pic:spPr>
+                </pic:pic>
+              </a:graphicData>
+            </a:graphic>
+          </wp:inline>
+        </w:drawing>
+      </w:r>
+    </w:p>
+    <w:p>
+      <w:pPr>
+        <w:spacing w:after="160" w:line="276" w:lineRule="auto"/>
+        <w:jc w:val="both"/>
+      </w:pPr>
+      <w:r>
+        <w:t>Figura 5. Catálogo de las 19 tools del agente MCP, agrupadas por familia, y las tres superficies que comparten el mismo chat.</w:t>
       </w:r>
     </w:p>
     <w:p>
@@ -5209,7 +5316,7 @@
         <w:jc w:val="center"/>
       </w:pPr>
       <w:r>
-        <w:t>Figura 4. Pipeline de modelado: del feature store al modelo servido por el asistente.</w:t>
+        <w:t>Figura 6. Pipeline de modelado: del feature store al modelo servido por el asistente.</w:t>
       </w:r>
     </w:p>
     <w:p>
@@ -5259,13 +5366,56 @@
     <w:p>
       <w:pPr/>
       <w:r>
+        <w:drawing>
+          <wp:inline xmlns:a="http://schemas.openxmlformats.org/drawingml/2006/main" xmlns:pic="http://schemas.openxmlformats.org/drawingml/2006/picture">
+            <wp:extent cx="5760720" cy="1944243"/>
+            <wp:docPr id="1217661475" name="Picture 1217661475"/>
+            <wp:cNvGraphicFramePr>
+              <a:graphicFrameLocks noChangeAspect="1"/>
+            </wp:cNvGraphicFramePr>
+            <a:graphic>
+              <a:graphicData uri="http://schemas.openxmlformats.org/drawingml/2006/picture">
+                <pic:pic>
+                  <pic:nvPicPr>
+                    <pic:cNvPr id="0" name="06_analitica_grafo.png"/>
+                    <pic:cNvPicPr/>
+                  </pic:nvPicPr>
+                  <pic:blipFill>
+                    <a:blip r:embed="rId21"/>
+                    <a:stretch>
+                      <a:fillRect/>
+                    </a:stretch>
+                  </pic:blipFill>
+                  <pic:spPr>
+                    <a:xfrm>
+                      <a:off x="0" y="0"/>
+                      <a:ext cx="5760720" cy="1944243"/>
+                    </a:xfrm>
+                    <a:prstGeom prst="rect"/>
+                  </pic:spPr>
+                </pic:pic>
+              </a:graphicData>
+            </a:graphic>
+          </wp:inline>
+        </w:drawing>
+      </w:r>
+    </w:p>
+    <w:p>
+      <w:pPr/>
+      <w:r>
+        <w:t>Figura 7. Pipeline de analítica de grafo: del snapshot offline a los artefactos que consumen el explorador en vivo y esta memoria.</w:t>
+      </w:r>
+    </w:p>
+    <w:p>
+      <w:pPr/>
+      <w:r>
         <w:t>Sobre el mismo grafo urbano se ha ejecutado una analítica estructural independiente de los modelos predictivos, con `networkx` de forma completamente offline sobre una foto fija del grafo (sin `Graph Data Science`, sin llamadas a Neo4j en caliente). Centralidad de intermediación (*betweenness*) y PageRank, junto con la detección de comunidades de Louvain sobre el subgrafo de proximidad espacial, identifican como puntos de paso obligado nodos con un perfil distinto al de mayor grado —Canillejas, Metro O'Donnell y Aeropuerto T1 por intermediación, frente a Castellana-José Vasconcelos, Santo Domingo y Plaza Castilla por PageRank, coherente con ser paradas EMT de alto grado—; las 54 comunidades detectadas capturan razonablemente la geografía real de los 131 barrios (NMI=0,75) sin ser una partición idéntica (ARI=0,36), como es esperable de un algoritmo que no conoce los límites administrativos.</w:t>
       </w:r>
     </w:p>
     <w:p>
       <w:pPr/>
       <w:r>
-        <w:t>Sobre la red de transporte modelada (`CONECTADO_CON`), un análisis de resiliencia estructural cuantifica además su fragilidad: 683 puntos de articulación y un 20 % de los tramos sin ninguna alternativa (puentes), coherente con una red poco mallada (`k_max=2`). Un ataque dirigido a las paradas de mayor intermediación fragmenta la red mucho más deprisa que un fallo aleatorio equivalente: al 5 % de bajas, el fragmento mayor cae a un 39,6 % de la red intacta frente a un 89,1 % bajo fallo aleatorio (Figura 5). Esta cifra usa un recálculo de intermediación por lotes (cada 25 bajas) por coste computacional —una aproximación estándar en el estudio de robustez de redes— que, verificado en un subgrafo de contraste, subestima el daño real; el 39,6 % es por tanto una cota optimista de la fragilidad, no un valor ajustado, aunque el hallazgo cualitativo —la vulnerabilidad estructural real de una red modelada con un único viaje representativo por línea, véase 5.3 y 6.6— se sostiene con independencia de esa aproximación.</w:t>
+        <w:t>Sobre la red de transporte modelada (`CONECTADO_CON`), un análisis de resiliencia estructural cuantifica además su fragilidad: 683 puntos de articulación y un 20 % de los tramos sin ninguna alternativa (puentes), coherente con una red poco mallada (`k_max=2`). Un ataque dirigido a las paradas de mayor intermediación fragmenta la red mucho más deprisa que un fallo aleatorio equivalente: al 5 % de bajas, el fragmento mayor cae a un 39,6 % de la red intacta frente a un 89,1 % bajo fallo aleatorio (Figura 8). Esta cifra usa un recálculo de intermediación por lotes (cada 25 bajas) por coste computacional —una aproximación estándar en el estudio de robustez de redes— que, verificado en un subgrafo de contraste, subestima el daño real; el 39,6 % es por tanto una cota optimista de la fragilidad, no un valor ajustado, aunque el hallazgo cualitativo —la vulnerabilidad estructural real de una red modelada con un único viaje representativo por línea, véase 5.3 y 6.6— se sostiene con independencia de esa aproximación.</w:t>
       </w:r>
     </w:p>
     <w:p>
@@ -5308,7 +5458,7 @@
     <w:p>
       <w:pPr/>
       <w:r>
-        <w:t>Figura 5. Curva de robustez de la red de transporte modelada: fracción del fragmento mayor frente a % de paradas eliminadas, ataque dirigido aproximado (línea sólida, recálculo de intermediación por lotes) vs aleatorio (línea discontinua).</w:t>
+        <w:t>Figura 8. Curva de robustez de la red de transporte modelada: fracción del fragmento mayor frente a % de paradas eliminadas, ataque dirigido aproximado (línea sólida, recálculo de intermediación por lotes) vs aleatorio (línea discontinua).</w:t>
       </w:r>
     </w:p>
     <w:p>
@@ -5890,7 +6040,7 @@
         <w:jc w:val="both"/>
       </w:pPr>
       <w:r>
-        <w:t>Analítica de grafo (`FIL_52`/`FIL_64`/`FIL_81`): `python -m modelado.grafo_analitica.analisis` regenera `grafo_centralidad.{json,png}` y `grafo_resiliencia.{json,png}` (Figura 5) desde `grafo/_data/grafo_urbano.json.gz`.</w:t>
+        <w:t>Analítica de grafo (`FIL_52`/`FIL_64`/`FIL_81`): `python -m modelado.grafo_analitica.analisis` regenera `grafo_centralidad.{json,png}` y `grafo_resiliencia.{json,png}` (Figura 8) desde `grafo/_data/grafo_urbano.json.gz`.</w:t>
       </w:r>
     </w:p>
     <w:p>

</xml_diff>